<commit_message>
Fix equation images with full mathematical typography and verify page 9 screenshot descriptions
</commit_message>
<xml_diff>
--- a/SparsioQ_End_Semester_Project_Report.docx
+++ b/SparsioQ_End_Semester_Project_Report.docx
@@ -2790,7 +2790,7 @@
             <w:r>
               <w:drawing>
                 <wp:inline xmlns:a="http://schemas.openxmlformats.org/drawingml/2006/main" xmlns:pic="http://schemas.openxmlformats.org/drawingml/2006/picture">
-                  <wp:extent cx="4023360" cy="408962"/>
+                  <wp:extent cx="4023360" cy="421235"/>
                   <wp:docPr id="2" name="Picture 2"/>
                   <wp:cNvGraphicFramePr>
                     <a:graphicFrameLocks noChangeAspect="1"/>
@@ -2811,7 +2811,7 @@
                         <pic:spPr>
                           <a:xfrm>
                             <a:off x="0" y="0"/>
-                            <a:ext cx="4023360" cy="408962"/>
+                            <a:ext cx="4023360" cy="421235"/>
                           </a:xfrm>
                           <a:prstGeom prst="rect"/>
                         </pic:spPr>
@@ -2884,7 +2884,7 @@
             <w:r>
               <w:drawing>
                 <wp:inline xmlns:a="http://schemas.openxmlformats.org/drawingml/2006/main" xmlns:pic="http://schemas.openxmlformats.org/drawingml/2006/picture">
-                  <wp:extent cx="4389120" cy="408343"/>
+                  <wp:extent cx="4389120" cy="420719"/>
                   <wp:docPr id="3" name="Picture 3"/>
                   <wp:cNvGraphicFramePr>
                     <a:graphicFrameLocks noChangeAspect="1"/>
@@ -2905,7 +2905,7 @@
                         <pic:spPr>
                           <a:xfrm>
                             <a:off x="0" y="0"/>
-                            <a:ext cx="4389120" cy="408343"/>
+                            <a:ext cx="4389120" cy="420719"/>
                           </a:xfrm>
                           <a:prstGeom prst="rect"/>
                         </pic:spPr>
@@ -2978,7 +2978,7 @@
             <w:r>
               <w:drawing>
                 <wp:inline xmlns:a="http://schemas.openxmlformats.org/drawingml/2006/main" xmlns:pic="http://schemas.openxmlformats.org/drawingml/2006/picture">
-                  <wp:extent cx="4114800" cy="392553"/>
+                  <wp:extent cx="4114800" cy="405193"/>
                   <wp:docPr id="4" name="Picture 4"/>
                   <wp:cNvGraphicFramePr>
                     <a:graphicFrameLocks noChangeAspect="1"/>
@@ -2999,7 +2999,7 @@
                         <pic:spPr>
                           <a:xfrm>
                             <a:off x="0" y="0"/>
-                            <a:ext cx="4114800" cy="392553"/>
+                            <a:ext cx="4114800" cy="405193"/>
                           </a:xfrm>
                           <a:prstGeom prst="rect"/>
                         </pic:spPr>
@@ -3088,7 +3088,7 @@
             <w:r>
               <w:drawing>
                 <wp:inline xmlns:a="http://schemas.openxmlformats.org/drawingml/2006/main" xmlns:pic="http://schemas.openxmlformats.org/drawingml/2006/picture">
-                  <wp:extent cx="4389120" cy="383250"/>
+                  <wp:extent cx="4389120" cy="395703"/>
                   <wp:docPr id="5" name="Picture 5"/>
                   <wp:cNvGraphicFramePr>
                     <a:graphicFrameLocks noChangeAspect="1"/>
@@ -3109,7 +3109,7 @@
                         <pic:spPr>
                           <a:xfrm>
                             <a:off x="0" y="0"/>
-                            <a:ext cx="4389120" cy="383250"/>
+                            <a:ext cx="4389120" cy="395703"/>
                           </a:xfrm>
                           <a:prstGeom prst="rect"/>
                         </pic:spPr>
@@ -3182,7 +3182,7 @@
             <w:r>
               <w:drawing>
                 <wp:inline xmlns:a="http://schemas.openxmlformats.org/drawingml/2006/main" xmlns:pic="http://schemas.openxmlformats.org/drawingml/2006/picture">
-                  <wp:extent cx="3291840" cy="391386"/>
+                  <wp:extent cx="3291840" cy="412930"/>
                   <wp:docPr id="6" name="Picture 6"/>
                   <wp:cNvGraphicFramePr>
                     <a:graphicFrameLocks noChangeAspect="1"/>
@@ -3203,7 +3203,7 @@
                         <pic:spPr>
                           <a:xfrm>
                             <a:off x="0" y="0"/>
-                            <a:ext cx="3291840" cy="391386"/>
+                            <a:ext cx="3291840" cy="412930"/>
                           </a:xfrm>
                           <a:prstGeom prst="rect"/>
                         </pic:spPr>
@@ -3313,7 +3313,7 @@
             <w:r>
               <w:drawing>
                 <wp:inline xmlns:a="http://schemas.openxmlformats.org/drawingml/2006/main" xmlns:pic="http://schemas.openxmlformats.org/drawingml/2006/picture">
-                  <wp:extent cx="4389120" cy="418345"/>
+                  <wp:extent cx="4389120" cy="430991"/>
                   <wp:docPr id="7" name="Picture 7"/>
                   <wp:cNvGraphicFramePr>
                     <a:graphicFrameLocks noChangeAspect="1"/>
@@ -3334,7 +3334,7 @@
                         <pic:spPr>
                           <a:xfrm>
                             <a:off x="0" y="0"/>
-                            <a:ext cx="4389120" cy="418345"/>
+                            <a:ext cx="4389120" cy="430991"/>
                           </a:xfrm>
                           <a:prstGeom prst="rect"/>
                         </pic:spPr>
@@ -3439,7 +3439,7 @@
             <w:r>
               <w:drawing>
                 <wp:inline xmlns:a="http://schemas.openxmlformats.org/drawingml/2006/main" xmlns:pic="http://schemas.openxmlformats.org/drawingml/2006/picture">
-                  <wp:extent cx="4023360" cy="408962"/>
+                  <wp:extent cx="4023360" cy="421235"/>
                   <wp:docPr id="8" name="Picture 8"/>
                   <wp:cNvGraphicFramePr>
                     <a:graphicFrameLocks noChangeAspect="1"/>
@@ -3448,11 +3448,11 @@
                     <a:graphicData uri="http://schemas.openxmlformats.org/drawingml/2006/picture">
                       <pic:pic>
                         <pic:nvPicPr>
-                          <pic:cNvPr id="0" name="eq1.png"/>
+                          <pic:cNvPr id="0" name="eq7.png"/>
                           <pic:cNvPicPr/>
                         </pic:nvPicPr>
                         <pic:blipFill>
-                          <a:blip r:embed="rId12"/>
+                          <a:blip r:embed="rId18"/>
                           <a:stretch>
                             <a:fillRect/>
                           </a:stretch>
@@ -3460,7 +3460,7 @@
                         <pic:spPr>
                           <a:xfrm>
                             <a:off x="0" y="0"/>
-                            <a:ext cx="4023360" cy="408962"/>
+                            <a:ext cx="4023360" cy="421235"/>
                           </a:xfrm>
                           <a:prstGeom prst="rect"/>
                         </pic:spPr>
@@ -3565,7 +3565,7 @@
             <w:r>
               <w:drawing>
                 <wp:inline xmlns:a="http://schemas.openxmlformats.org/drawingml/2006/main" xmlns:pic="http://schemas.openxmlformats.org/drawingml/2006/picture">
-                  <wp:extent cx="4389120" cy="392637"/>
+                  <wp:extent cx="4389120" cy="405365"/>
                   <wp:docPr id="9" name="Picture 9"/>
                   <wp:cNvGraphicFramePr>
                     <a:graphicFrameLocks noChangeAspect="1"/>
@@ -3578,7 +3578,7 @@
                           <pic:cNvPicPr/>
                         </pic:nvPicPr>
                         <pic:blipFill>
-                          <a:blip r:embed="rId18"/>
+                          <a:blip r:embed="rId19"/>
                           <a:stretch>
                             <a:fillRect/>
                           </a:stretch>
@@ -3586,7 +3586,7 @@
                         <pic:spPr>
                           <a:xfrm>
                             <a:off x="0" y="0"/>
-                            <a:ext cx="4389120" cy="392637"/>
+                            <a:ext cx="4389120" cy="405365"/>
                           </a:xfrm>
                           <a:prstGeom prst="rect"/>
                         </pic:spPr>
@@ -3703,7 +3703,7 @@
                           <pic:cNvPicPr/>
                         </pic:nvPicPr>
                         <pic:blipFill>
-                          <a:blip r:embed="rId19"/>
+                          <a:blip r:embed="rId20"/>
                           <a:stretch>
                             <a:fillRect/>
                           </a:stretch>
@@ -3747,7 +3747,7 @@
                           <pic:cNvPicPr/>
                         </pic:nvPicPr>
                         <pic:blipFill>
-                          <a:blip r:embed="rId20"/>
+                          <a:blip r:embed="rId21"/>
                           <a:stretch>
                             <a:fillRect/>
                           </a:stretch>
@@ -5916,7 +5916,7 @@
                           <pic:cNvPicPr/>
                         </pic:nvPicPr>
                         <pic:blipFill>
-                          <a:blip r:embed="rId21"/>
+                          <a:blip r:embed="rId22"/>
                           <a:stretch>
                             <a:fillRect/>
                           </a:stretch>
@@ -5960,7 +5960,7 @@
                           <pic:cNvPicPr/>
                         </pic:nvPicPr>
                         <pic:blipFill>
-                          <a:blip r:embed="rId22"/>
+                          <a:blip r:embed="rId23"/>
                           <a:stretch>
                             <a:fillRect/>
                           </a:stretch>
@@ -6006,7 +6006,7 @@
                           <pic:cNvPicPr/>
                         </pic:nvPicPr>
                         <pic:blipFill>
-                          <a:blip r:embed="rId23"/>
+                          <a:blip r:embed="rId24"/>
                           <a:stretch>
                             <a:fillRect/>
                           </a:stretch>
@@ -6050,7 +6050,7 @@
                           <pic:cNvPicPr/>
                         </pic:nvPicPr>
                         <pic:blipFill>
-                          <a:blip r:embed="rId24"/>
+                          <a:blip r:embed="rId25"/>
                           <a:stretch>
                             <a:fillRect/>
                           </a:stretch>

</xml_diff>

<commit_message>
Final cross-checked report: Embed official Amrita emblem, fix Type-1 typography encoding, and verify 11 pages
</commit_message>
<xml_diff>
--- a/SparsioQ_End_Semester_Project_Report.docx
+++ b/SparsioQ_End_Semester_Project_Report.docx
@@ -31,7 +31,47 @@
           <w:color w:val="505A69"/>
           <w:sz w:val="19"/>
         </w:rPr>
-        <w:t>DEPARTMENT OF ARTIFICIAL INTELLIGENCE · SCHOOL OF COMPUTING</w:t>
+        <w:t>DEPARTMENT OF ARTIFICIAL INTELLIGENCE  |  SCHOOL OF COMPUTING</w:t>
+      </w:r>
+    </w:p>
+    <w:p>
+      <w:pPr>
+        <w:spacing w:after="200"/>
+        <w:jc w:val="center"/>
+      </w:pPr>
+      <w:r>
+        <w:drawing>
+          <wp:inline xmlns:a="http://schemas.openxmlformats.org/drawingml/2006/main" xmlns:pic="http://schemas.openxmlformats.org/drawingml/2006/picture">
+            <wp:extent cx="1463040" cy="324326"/>
+            <wp:docPr id="1" name="Picture 1"/>
+            <wp:cNvGraphicFramePr>
+              <a:graphicFrameLocks noChangeAspect="1"/>
+            </wp:cNvGraphicFramePr>
+            <a:graphic>
+              <a:graphicData uri="http://schemas.openxmlformats.org/drawingml/2006/picture">
+                <pic:pic>
+                  <pic:nvPicPr>
+                    <pic:cNvPr id="0" name="amrita_logo_official.png"/>
+                    <pic:cNvPicPr/>
+                  </pic:nvPicPr>
+                  <pic:blipFill>
+                    <a:blip r:embed="rId11"/>
+                    <a:stretch>
+                      <a:fillRect/>
+                    </a:stretch>
+                  </pic:blipFill>
+                  <pic:spPr>
+                    <a:xfrm>
+                      <a:off x="0" y="0"/>
+                      <a:ext cx="1463040" cy="324326"/>
+                    </a:xfrm>
+                    <a:prstGeom prst="rect"/>
+                  </pic:spPr>
+                </pic:pic>
+              </a:graphicData>
+            </a:graphic>
+          </wp:inline>
+        </w:drawing>
       </w:r>
     </w:p>
     <w:p>
@@ -95,7 +135,7 @@
           <w:color w:val="0F2A4A"/>
           <w:sz w:val="21"/>
         </w:rPr>
-        <w:t>Course: 24MAT204 / 23MAT204 – Mathematics for Intelligent Systems 3</w:t>
+        <w:t>Course: 24MAT204 / 23MAT204 - Mathematics for Intelligent Systems 3</w:t>
       </w:r>
     </w:p>
     <w:p>
@@ -111,7 +151,7 @@
           <w:color w:val="A32A2A"/>
           <w:sz w:val="19"/>
         </w:rPr>
-        <w:t>End-Semester Project Report · Academic Year 2025–2026</w:t>
+        <w:t>End-Semester Project Report  |  Academic Year 2025-2026</w:t>
       </w:r>
     </w:p>
     <w:p>
@@ -445,7 +485,7 @@
           <w:color w:val="505A69"/>
           <w:sz w:val="17"/>
         </w:rPr>
-        <w:t>October 2026 · Coimbatore Campus, Tamil Nadu, India</w:t>
+        <w:t>October 2026  |  Coimbatore Campus, Tamil Nadu, India</w:t>
       </w:r>
     </w:p>
     <w:p>
@@ -461,7 +501,7 @@
           <w:color w:val="335C8D"/>
           <w:sz w:val="16"/>
         </w:rPr>
-        <w:t>Live Platform: https://sparsioq-platform.streamlit.app · GitHub: https://github.com/mhalsa-aine/SparsioQ-Platform.git</w:t>
+        <w:t>Live Platform: https://sparsioq-platform.streamlit.app  |  GitHub: https://github.com/mhalsa-aine/SparsioQ-Platform.git</w:t>
       </w:r>
     </w:p>
     <w:p>
@@ -1065,7 +1105,7 @@
                 <w:b/>
                 <w:sz w:val="16"/>
               </w:rPr>
-              <w:t>References [1] – [12]</w:t>
+              <w:t>References [1] - [12]</w:t>
             </w:r>
           </w:p>
         </w:tc>
@@ -1227,7 +1267,7 @@
           <w:color w:val="1E232A"/>
           <w:sz w:val="17"/>
         </w:rPr>
-        <w:t xml:space="preserve"> Large price movements tend to be followed by large movements of unpredictable sign, and calm periods cluster together. This persistence—initially formalized by Engle's ARCH framework [6] and extended to non-stationary Markov state switches [4]—implies that volatility regimes can be identified and hedged before ruinous drawdowns materialize.</w:t>
+        <w:t xml:space="preserve"> Large price movements tend to be followed by large movements of unpredictable sign, and calm periods cluster together. This persistence--initially formalized by Engle's ARCH framework [6] and extended to non-stationary Markov state switches [4]--implies that volatility regimes can be identified and hedged before ruinous drawdowns materialize.</w:t>
       </w:r>
     </w:p>
     <w:p>
@@ -2619,7 +2659,7 @@
         <w:drawing>
           <wp:inline xmlns:a="http://schemas.openxmlformats.org/drawingml/2006/main" xmlns:pic="http://schemas.openxmlformats.org/drawingml/2006/picture">
             <wp:extent cx="6217920" cy="1318953"/>
-            <wp:docPr id="1" name="Picture 1"/>
+            <wp:docPr id="2" name="Picture 2"/>
             <wp:cNvGraphicFramePr>
               <a:graphicFrameLocks noChangeAspect="1"/>
             </wp:cNvGraphicFramePr>
@@ -2631,7 +2671,7 @@
                     <pic:cNvPicPr/>
                   </pic:nvPicPr>
                   <pic:blipFill>
-                    <a:blip r:embed="rId11"/>
+                    <a:blip r:embed="rId12"/>
                     <a:stretch>
                       <a:fillRect/>
                     </a:stretch>
@@ -2791,7 +2831,7 @@
               <w:drawing>
                 <wp:inline xmlns:a="http://schemas.openxmlformats.org/drawingml/2006/main" xmlns:pic="http://schemas.openxmlformats.org/drawingml/2006/picture">
                   <wp:extent cx="4023360" cy="421235"/>
-                  <wp:docPr id="2" name="Picture 2"/>
+                  <wp:docPr id="3" name="Picture 3"/>
                   <wp:cNvGraphicFramePr>
                     <a:graphicFrameLocks noChangeAspect="1"/>
                   </wp:cNvGraphicFramePr>
@@ -2803,7 +2843,7 @@
                           <pic:cNvPicPr/>
                         </pic:nvPicPr>
                         <pic:blipFill>
-                          <a:blip r:embed="rId12"/>
+                          <a:blip r:embed="rId13"/>
                           <a:stretch>
                             <a:fillRect/>
                           </a:stretch>
@@ -2885,7 +2925,7 @@
               <w:drawing>
                 <wp:inline xmlns:a="http://schemas.openxmlformats.org/drawingml/2006/main" xmlns:pic="http://schemas.openxmlformats.org/drawingml/2006/picture">
                   <wp:extent cx="4389120" cy="420719"/>
-                  <wp:docPr id="3" name="Picture 3"/>
+                  <wp:docPr id="4" name="Picture 4"/>
                   <wp:cNvGraphicFramePr>
                     <a:graphicFrameLocks noChangeAspect="1"/>
                   </wp:cNvGraphicFramePr>
@@ -2897,7 +2937,7 @@
                           <pic:cNvPicPr/>
                         </pic:nvPicPr>
                         <pic:blipFill>
-                          <a:blip r:embed="rId13"/>
+                          <a:blip r:embed="rId14"/>
                           <a:stretch>
                             <a:fillRect/>
                           </a:stretch>
@@ -2979,7 +3019,7 @@
               <w:drawing>
                 <wp:inline xmlns:a="http://schemas.openxmlformats.org/drawingml/2006/main" xmlns:pic="http://schemas.openxmlformats.org/drawingml/2006/picture">
                   <wp:extent cx="4114800" cy="405193"/>
-                  <wp:docPr id="4" name="Picture 4"/>
+                  <wp:docPr id="5" name="Picture 5"/>
                   <wp:cNvGraphicFramePr>
                     <a:graphicFrameLocks noChangeAspect="1"/>
                   </wp:cNvGraphicFramePr>
@@ -2991,7 +3031,7 @@
                           <pic:cNvPicPr/>
                         </pic:nvPicPr>
                         <pic:blipFill>
-                          <a:blip r:embed="rId14"/>
+                          <a:blip r:embed="rId15"/>
                           <a:stretch>
                             <a:fillRect/>
                           </a:stretch>
@@ -3089,7 +3129,7 @@
               <w:drawing>
                 <wp:inline xmlns:a="http://schemas.openxmlformats.org/drawingml/2006/main" xmlns:pic="http://schemas.openxmlformats.org/drawingml/2006/picture">
                   <wp:extent cx="4389120" cy="395703"/>
-                  <wp:docPr id="5" name="Picture 5"/>
+                  <wp:docPr id="6" name="Picture 6"/>
                   <wp:cNvGraphicFramePr>
                     <a:graphicFrameLocks noChangeAspect="1"/>
                   </wp:cNvGraphicFramePr>
@@ -3101,7 +3141,7 @@
                           <pic:cNvPicPr/>
                         </pic:nvPicPr>
                         <pic:blipFill>
-                          <a:blip r:embed="rId15"/>
+                          <a:blip r:embed="rId16"/>
                           <a:stretch>
                             <a:fillRect/>
                           </a:stretch>
@@ -3183,7 +3223,7 @@
               <w:drawing>
                 <wp:inline xmlns:a="http://schemas.openxmlformats.org/drawingml/2006/main" xmlns:pic="http://schemas.openxmlformats.org/drawingml/2006/picture">
                   <wp:extent cx="3291840" cy="412930"/>
-                  <wp:docPr id="6" name="Picture 6"/>
+                  <wp:docPr id="7" name="Picture 7"/>
                   <wp:cNvGraphicFramePr>
                     <a:graphicFrameLocks noChangeAspect="1"/>
                   </wp:cNvGraphicFramePr>
@@ -3195,7 +3235,7 @@
                           <pic:cNvPicPr/>
                         </pic:nvPicPr>
                         <pic:blipFill>
-                          <a:blip r:embed="rId16"/>
+                          <a:blip r:embed="rId17"/>
                           <a:stretch>
                             <a:fillRect/>
                           </a:stretch>
@@ -3314,7 +3354,7 @@
               <w:drawing>
                 <wp:inline xmlns:a="http://schemas.openxmlformats.org/drawingml/2006/main" xmlns:pic="http://schemas.openxmlformats.org/drawingml/2006/picture">
                   <wp:extent cx="4389120" cy="430991"/>
-                  <wp:docPr id="7" name="Picture 7"/>
+                  <wp:docPr id="8" name="Picture 8"/>
                   <wp:cNvGraphicFramePr>
                     <a:graphicFrameLocks noChangeAspect="1"/>
                   </wp:cNvGraphicFramePr>
@@ -3326,7 +3366,7 @@
                           <pic:cNvPicPr/>
                         </pic:nvPicPr>
                         <pic:blipFill>
-                          <a:blip r:embed="rId17"/>
+                          <a:blip r:embed="rId18"/>
                           <a:stretch>
                             <a:fillRect/>
                           </a:stretch>
@@ -3440,7 +3480,7 @@
               <w:drawing>
                 <wp:inline xmlns:a="http://schemas.openxmlformats.org/drawingml/2006/main" xmlns:pic="http://schemas.openxmlformats.org/drawingml/2006/picture">
                   <wp:extent cx="4023360" cy="421235"/>
-                  <wp:docPr id="8" name="Picture 8"/>
+                  <wp:docPr id="9" name="Picture 9"/>
                   <wp:cNvGraphicFramePr>
                     <a:graphicFrameLocks noChangeAspect="1"/>
                   </wp:cNvGraphicFramePr>
@@ -3452,7 +3492,7 @@
                           <pic:cNvPicPr/>
                         </pic:nvPicPr>
                         <pic:blipFill>
-                          <a:blip r:embed="rId18"/>
+                          <a:blip r:embed="rId19"/>
                           <a:stretch>
                             <a:fillRect/>
                           </a:stretch>
@@ -3566,7 +3606,7 @@
               <w:drawing>
                 <wp:inline xmlns:a="http://schemas.openxmlformats.org/drawingml/2006/main" xmlns:pic="http://schemas.openxmlformats.org/drawingml/2006/picture">
                   <wp:extent cx="4389120" cy="405365"/>
-                  <wp:docPr id="9" name="Picture 9"/>
+                  <wp:docPr id="10" name="Picture 10"/>
                   <wp:cNvGraphicFramePr>
                     <a:graphicFrameLocks noChangeAspect="1"/>
                   </wp:cNvGraphicFramePr>
@@ -3578,7 +3618,7 @@
                           <pic:cNvPicPr/>
                         </pic:nvPicPr>
                         <pic:blipFill>
-                          <a:blip r:embed="rId19"/>
+                          <a:blip r:embed="rId20"/>
                           <a:stretch>
                             <a:fillRect/>
                           </a:stretch>
@@ -3691,7 +3731,7 @@
               <w:drawing>
                 <wp:inline xmlns:a="http://schemas.openxmlformats.org/drawingml/2006/main" xmlns:pic="http://schemas.openxmlformats.org/drawingml/2006/picture">
                   <wp:extent cx="3063240" cy="1610409"/>
-                  <wp:docPr id="10" name="Picture 10"/>
+                  <wp:docPr id="11" name="Picture 11"/>
                   <wp:cNvGraphicFramePr>
                     <a:graphicFrameLocks noChangeAspect="1"/>
                   </wp:cNvGraphicFramePr>
@@ -3703,7 +3743,7 @@
                           <pic:cNvPicPr/>
                         </pic:nvPicPr>
                         <pic:blipFill>
-                          <a:blip r:embed="rId20"/>
+                          <a:blip r:embed="rId21"/>
                           <a:stretch>
                             <a:fillRect/>
                           </a:stretch>
@@ -3735,7 +3775,7 @@
               <w:drawing>
                 <wp:inline xmlns:a="http://schemas.openxmlformats.org/drawingml/2006/main" xmlns:pic="http://schemas.openxmlformats.org/drawingml/2006/picture">
                   <wp:extent cx="3063240" cy="1613145"/>
-                  <wp:docPr id="11" name="Picture 11"/>
+                  <wp:docPr id="12" name="Picture 12"/>
                   <wp:cNvGraphicFramePr>
                     <a:graphicFrameLocks noChangeAspect="1"/>
                   </wp:cNvGraphicFramePr>
@@ -3747,7 +3787,7 @@
                           <pic:cNvPicPr/>
                         </pic:nvPicPr>
                         <pic:blipFill>
-                          <a:blip r:embed="rId21"/>
+                          <a:blip r:embed="rId22"/>
                           <a:stretch>
                             <a:fillRect/>
                           </a:stretch>
@@ -4830,7 +4870,7 @@
           <w:color w:val="0F2A4A"/>
           <w:sz w:val="17"/>
         </w:rPr>
-        <w:t>Table 5: Quantitative Empirical Performance: SparsioQ vs. Benchmarks (2020–2026 Backtest)</w:t>
+        <w:t>Table 5: Quantitative Empirical Performance: SparsioQ vs. Benchmarks (2020-2026 Backtest)</w:t>
       </w:r>
     </w:p>
     <w:tbl>
@@ -5327,7 +5367,7 @@
           <w:color w:val="1E232A"/>
           <w:sz w:val="17"/>
         </w:rPr>
-        <w:t>To rigorously validate SparsioQ, extensive backtests were executed spanning the COVID-19 liquidity shock (2020), the post-pandemic recovery (2021), the global monetary tightening cycle (2022–2023), and the structural bull market (2024–2026).</w:t>
+        <w:t>To rigorously validate SparsioQ, extensive backtests were executed spanning the COVID-19 liquidity shock (2020), the post-pandemic recovery (2021), the global monetary tightening cycle (2022-2023), and the structural bull market (2024-2026).</w:t>
       </w:r>
     </w:p>
     <w:p>
@@ -5904,7 +5944,7 @@
               <w:drawing>
                 <wp:inline xmlns:a="http://schemas.openxmlformats.org/drawingml/2006/main" xmlns:pic="http://schemas.openxmlformats.org/drawingml/2006/picture">
                   <wp:extent cx="3063240" cy="1411962"/>
-                  <wp:docPr id="12" name="Picture 12"/>
+                  <wp:docPr id="13" name="Picture 13"/>
                   <wp:cNvGraphicFramePr>
                     <a:graphicFrameLocks noChangeAspect="1"/>
                   </wp:cNvGraphicFramePr>
@@ -5916,7 +5956,7 @@
                           <pic:cNvPicPr/>
                         </pic:nvPicPr>
                         <pic:blipFill>
-                          <a:blip r:embed="rId22"/>
+                          <a:blip r:embed="rId23"/>
                           <a:stretch>
                             <a:fillRect/>
                           </a:stretch>
@@ -5948,7 +5988,7 @@
               <w:drawing>
                 <wp:inline xmlns:a="http://schemas.openxmlformats.org/drawingml/2006/main" xmlns:pic="http://schemas.openxmlformats.org/drawingml/2006/picture">
                   <wp:extent cx="3063240" cy="1405979"/>
-                  <wp:docPr id="13" name="Picture 13"/>
+                  <wp:docPr id="14" name="Picture 14"/>
                   <wp:cNvGraphicFramePr>
                     <a:graphicFrameLocks noChangeAspect="1"/>
                   </wp:cNvGraphicFramePr>
@@ -5960,7 +6000,7 @@
                           <pic:cNvPicPr/>
                         </pic:nvPicPr>
                         <pic:blipFill>
-                          <a:blip r:embed="rId23"/>
+                          <a:blip r:embed="rId24"/>
                           <a:stretch>
                             <a:fillRect/>
                           </a:stretch>
@@ -5994,7 +6034,7 @@
               <w:drawing>
                 <wp:inline xmlns:a="http://schemas.openxmlformats.org/drawingml/2006/main" xmlns:pic="http://schemas.openxmlformats.org/drawingml/2006/picture">
                   <wp:extent cx="3063240" cy="1411962"/>
-                  <wp:docPr id="14" name="Picture 14"/>
+                  <wp:docPr id="15" name="Picture 15"/>
                   <wp:cNvGraphicFramePr>
                     <a:graphicFrameLocks noChangeAspect="1"/>
                   </wp:cNvGraphicFramePr>
@@ -6006,7 +6046,7 @@
                           <pic:cNvPicPr/>
                         </pic:nvPicPr>
                         <pic:blipFill>
-                          <a:blip r:embed="rId24"/>
+                          <a:blip r:embed="rId25"/>
                           <a:stretch>
                             <a:fillRect/>
                           </a:stretch>
@@ -6038,7 +6078,7 @@
               <w:drawing>
                 <wp:inline xmlns:a="http://schemas.openxmlformats.org/drawingml/2006/main" xmlns:pic="http://schemas.openxmlformats.org/drawingml/2006/picture">
                   <wp:extent cx="3063240" cy="1408971"/>
-                  <wp:docPr id="15" name="Picture 15"/>
+                  <wp:docPr id="16" name="Picture 16"/>
                   <wp:cNvGraphicFramePr>
                     <a:graphicFrameLocks noChangeAspect="1"/>
                   </wp:cNvGraphicFramePr>
@@ -6050,7 +6090,7 @@
                           <pic:cNvPicPr/>
                         </pic:nvPicPr>
                         <pic:blipFill>
-                          <a:blip r:embed="rId25"/>
+                          <a:blip r:embed="rId26"/>
                           <a:stretch>
                             <a:fillRect/>
                           </a:stretch>
@@ -6399,7 +6439,7 @@
           <w:color w:val="1E232A"/>
           <w:sz w:val="15"/>
         </w:rPr>
-        <w:t>[1] H. Markowitz, 'Portfolio Selection,' The Journal of Finance, vol. 7, no. 1, pp. 77–91, 1952.</w:t>
+        <w:t>[1] H. Markowitz, 'Portfolio Selection,' The Journal of Finance, vol. 7, no. 1, pp. 77-91, 1952.</w:t>
       </w:r>
     </w:p>
     <w:p>
@@ -6438,7 +6478,7 @@
           <w:color w:val="1E232A"/>
           <w:sz w:val="15"/>
         </w:rPr>
-        <w:t>[4] L. R. Rabiner, 'A tutorial on hidden Markov models and selected applications in speech recognition,' Proc. IEEE, vol. 77, no. 2, pp. 257–286, 1989.</w:t>
+        <w:t>[4] L. R. Rabiner, 'A tutorial on hidden Markov models and selected applications in speech recognition,' Proc. IEEE, vol. 77, no. 2, pp. 257-286, 1989.</w:t>
       </w:r>
     </w:p>
     <w:p>
@@ -6451,7 +6491,7 @@
           <w:color w:val="1E232A"/>
           <w:sz w:val="15"/>
         </w:rPr>
-        <w:t>[5] G. Brassard, P. Hoyer, M. Mosca, and A. Tapp, 'Quantum amplitude amplification and estimation,' Contemporary Mathematics, vol. 305, pp. 53–74, 2002.</w:t>
+        <w:t>[5] G. Brassard, P. Hoyer, M. Mosca, and A. Tapp, 'Quantum amplitude amplification and estimation,' Contemporary Mathematics, vol. 305, pp. 53-74, 2002.</w:t>
       </w:r>
     </w:p>
     <w:p>
@@ -6464,7 +6504,7 @@
           <w:color w:val="1E232A"/>
           <w:sz w:val="15"/>
         </w:rPr>
-        <w:t>[6] F. Black and M. Scholes, 'The Pricing of Options and Corporate Liabilities,' Journal of Political Economy, vol. 81, no. 3, pp. 637–654, 1973.</w:t>
+        <w:t>[6] F. Black and M. Scholes, 'The Pricing of Options and Corporate Liabilities,' Journal of Political Economy, vol. 81, no. 3, pp. 637-654, 1973.</w:t>
       </w:r>
     </w:p>
     <w:p>
@@ -6477,7 +6517,7 @@
           <w:color w:val="1E232A"/>
           <w:sz w:val="15"/>
         </w:rPr>
-        <w:t>[7] L. De Lathauwer, B. De Moor, and J. Vandewalle, 'A multilinear singular value decomposition,' SIAM J. Matrix Anal. Appl., vol. 21, no. 4, pp. 1253–1278, 2000.</w:t>
+        <w:t>[7] L. De Lathauwer, B. De Moor, and J. Vandewalle, 'A multilinear singular value decomposition,' SIAM J. Matrix Anal. Appl., vol. 21, no. 4, pp. 1253-1278, 2000.</w:t>
       </w:r>
     </w:p>
     <w:p>
@@ -6490,7 +6530,7 @@
           <w:color w:val="1E232A"/>
           <w:sz w:val="15"/>
         </w:rPr>
-        <w:t>[8] R. Tibshirani, 'Regression shrinkage and selection via the lasso,' J. Royal Statistical Soc., Series B, vol. 58, no. 1, pp. 267–288, 1996.</w:t>
+        <w:t>[8] R. Tibshirani, 'Regression shrinkage and selection via the lasso,' J. Royal Statistical Soc., Series B, vol. 58, no. 1, pp. 267-288, 1996.</w:t>
       </w:r>
     </w:p>
     <w:p>
@@ -6503,7 +6543,7 @@
           <w:color w:val="1E232A"/>
           <w:sz w:val="15"/>
         </w:rPr>
-        <w:t>[9] R. F. Engle, 'Autoregressive conditional heteroscedasticity with estimates of the variance of United Kingdom inflation,' Econometrica, vol. 50, no. 4, pp. 987–1007, 1982.</w:t>
+        <w:t>[9] R. F. Engle, 'Autoregressive conditional heteroscedasticity with estimates of the variance of United Kingdom inflation,' Econometrica, vol. 50, no. 4, pp. 987-1007, 1982.</w:t>
       </w:r>
     </w:p>
     <w:p>
@@ -6542,7 +6582,7 @@
           <w:color w:val="1E232A"/>
           <w:sz w:val="15"/>
         </w:rPr>
-        <w:t>[12] J. K. Kokolakis et al., 'Multilinear algebra and tensor rank in portfolio risk modeling,' IEEE Trans. Signal Processing, vol. 68, pp. 4102–4116, 2020.</w:t>
+        <w:t>[12] J. K. Kokolakis et al., 'Multilinear algebra and tensor rank in portfolio risk modeling,' IEEE Trans. Signal Processing, vol. 68, pp. 4102-4116, 2020.</w:t>
       </w:r>
     </w:p>
     <w:p>
@@ -6773,7 +6813,7 @@
                 <w:color w:val="1E232A"/>
                 <w:sz w:val="14"/>
               </w:rPr>
-              <w:t>₹2,748.50</w:t>
+              <w:t>Rs. 2,748.50</w:t>
             </w:r>
           </w:p>
         </w:tc>
@@ -6875,7 +6915,7 @@
                 <w:color w:val="1E232A"/>
                 <w:sz w:val="14"/>
               </w:rPr>
-              <w:t>₹3,912.10</w:t>
+              <w:t>Rs. 3,912.10</w:t>
             </w:r>
           </w:p>
         </w:tc>
@@ -6977,7 +7017,7 @@
                 <w:color w:val="1E232A"/>
                 <w:sz w:val="14"/>
               </w:rPr>
-              <w:t>₹1,682.40</w:t>
+              <w:t>Rs. 1,682.40</w:t>
             </w:r>
           </w:p>
         </w:tc>
@@ -7079,7 +7119,7 @@
                 <w:color w:val="1E232A"/>
                 <w:sz w:val="14"/>
               </w:rPr>
-              <w:t>₹1,845.30</w:t>
+              <w:t>Rs. 1,845.30</w:t>
             </w:r>
           </w:p>
         </w:tc>
@@ -7181,7 +7221,7 @@
                 <w:color w:val="1E232A"/>
                 <w:sz w:val="14"/>
               </w:rPr>
-              <w:t>₹1,264.80</w:t>
+              <w:t>Rs. 1,264.80</w:t>
             </w:r>
           </w:p>
         </w:tc>
@@ -7283,7 +7323,7 @@
                 <w:color w:val="1E232A"/>
                 <w:sz w:val="14"/>
               </w:rPr>
-              <w:t>₹1,695.20</w:t>
+              <w:t>Rs. 1,695.20</w:t>
             </w:r>
           </w:p>
         </w:tc>
@@ -7384,7 +7424,7 @@
                 <w:color w:val="1E232A"/>
                 <w:sz w:val="14"/>
               </w:rPr>
-              <w:t>₹478.20</w:t>
+              <w:t>Rs. 478.20</w:t>
             </w:r>
           </w:p>
         </w:tc>
@@ -7485,7 +7525,7 @@
                 <w:color w:val="1E232A"/>
                 <w:sz w:val="14"/>
               </w:rPr>
-              <w:t>₹792.40</w:t>
+              <w:t>Rs. 792.40</w:t>
             </w:r>
           </w:p>
         </w:tc>
@@ -7586,7 +7626,7 @@
                 <w:color w:val="1E232A"/>
                 <w:sz w:val="14"/>
               </w:rPr>
-              <w:t>₹942.60</w:t>
+              <w:t>Rs. 942.60</w:t>
             </w:r>
           </w:p>
         </w:tc>
@@ -7687,7 +7727,7 @@
                 <w:color w:val="1E232A"/>
                 <w:sz w:val="14"/>
               </w:rPr>
-              <w:t>₹2,384.50</w:t>
+              <w:t>Rs. 2,384.50</w:t>
             </w:r>
           </w:p>
         </w:tc>
@@ -7788,7 +7828,7 @@
                 <w:color w:val="1E232A"/>
                 <w:sz w:val="14"/>
               </w:rPr>
-              <w:t>₹3,540.00</w:t>
+              <w:t>Rs. 3,540.00</w:t>
             </w:r>
           </w:p>
         </w:tc>
@@ -7889,7 +7929,7 @@
                 <w:color w:val="1E232A"/>
                 <w:sz w:val="14"/>
               </w:rPr>
-              <w:t>₹6,890.00</w:t>
+              <w:t>Rs. 6,890.00</w:t>
             </w:r>
           </w:p>
         </w:tc>
@@ -7990,7 +8030,7 @@
                 <w:color w:val="1E232A"/>
                 <w:sz w:val="14"/>
               </w:rPr>
-              <w:t>₹1,820.40</w:t>
+              <w:t>Rs. 1,820.40</w:t>
             </w:r>
           </w:p>
         </w:tc>
@@ -8091,7 +8131,7 @@
                 <w:color w:val="1E232A"/>
                 <w:sz w:val="14"/>
               </w:rPr>
-              <w:t>₹11,450.00</w:t>
+              <w:t>Rs. 11,450.00</w:t>
             </w:r>
           </w:p>
         </w:tc>
@@ -8192,7 +8232,7 @@
                 <w:color w:val="1E232A"/>
                 <w:sz w:val="14"/>
               </w:rPr>
-              <w:t>₹1,740.00</w:t>
+              <w:t>Rs. 1,740.00</w:t>
             </w:r>
           </w:p>
         </w:tc>
@@ -8293,7 +8333,7 @@
                 <w:color w:val="1E232A"/>
                 <w:sz w:val="14"/>
               </w:rPr>
-              <w:t>₹2,820.00</w:t>
+              <w:t>Rs. 2,820.00</w:t>
             </w:r>
           </w:p>
         </w:tc>
@@ -8394,7 +8434,7 @@
                 <w:color w:val="1E232A"/>
                 <w:sz w:val="14"/>
               </w:rPr>
-              <w:t>₹1,780.00</w:t>
+              <w:t>Rs. 1,780.00</w:t>
             </w:r>
           </w:p>
         </w:tc>
@@ -8495,7 +8535,7 @@
                 <w:color w:val="1E232A"/>
                 <w:sz w:val="14"/>
               </w:rPr>
-              <w:t>₹3,410.00</w:t>
+              <w:t>Rs. 3,410.00</w:t>
             </w:r>
           </w:p>
         </w:tc>
@@ -8596,7 +8636,7 @@
                 <w:color w:val="1E232A"/>
                 <w:sz w:val="14"/>
               </w:rPr>
-              <w:t>₹265.40</w:t>
+              <w:t>Rs. 265.40</w:t>
             </w:r>
           </w:p>
         </w:tc>
@@ -8697,7 +8737,7 @@
                 <w:color w:val="1E232A"/>
                 <w:sz w:val="14"/>
               </w:rPr>
-              <w:t>₹875.20</w:t>
+              <w:t>Rs. 875.20</w:t>
             </w:r>
           </w:p>
         </w:tc>
@@ -8798,7 +8838,7 @@
                 <w:color w:val="1E232A"/>
                 <w:sz w:val="14"/>
               </w:rPr>
-              <w:t>₹385.60</w:t>
+              <w:t>Rs. 385.60</w:t>
             </w:r>
           </w:p>
         </w:tc>
@@ -8899,7 +8939,7 @@
                 <w:color w:val="1E232A"/>
                 <w:sz w:val="14"/>
               </w:rPr>
-              <w:t>₹1,145.00</w:t>
+              <w:t>Rs. 1,145.00</w:t>
             </w:r>
           </w:p>
         </w:tc>
@@ -9000,7 +9040,7 @@
                 <w:color w:val="1E232A"/>
                 <w:sz w:val="14"/>
               </w:rPr>
-              <w:t>₹312.00</w:t>
+              <w:t>Rs. 312.00</w:t>
             </w:r>
           </w:p>
         </w:tc>
@@ -9101,7 +9141,7 @@
                 <w:color w:val="1E232A"/>
                 <w:sz w:val="14"/>
               </w:rPr>
-              <w:t>₹2,450.00</w:t>
+              <w:t>Rs. 2,450.00</w:t>
             </w:r>
           </w:p>
         </w:tc>
@@ -9202,7 +9242,7 @@
                 <w:color w:val="1E232A"/>
                 <w:sz w:val="14"/>
               </w:rPr>
-              <w:t>₹535.40</w:t>
+              <w:t>Rs. 535.40</w:t>
             </w:r>
           </w:p>
         </w:tc>
@@ -9261,7 +9301,7 @@
         <w:color w:val="505A69"/>
         <w:sz w:val="16"/>
       </w:rPr>
-      <w:t>Amrita Vishwa Vidyapeetham, Coimbatore – October 2026</w:t>
+      <w:t>Amrita Vishwa Vidyapeetham, Coimbatore - October 2026</w:t>
     </w:r>
   </w:p>
 </w:ftr>
@@ -9280,7 +9320,7 @@
         <w:color w:val="505A69"/>
         <w:sz w:val="16"/>
       </w:rPr>
-      <w:t>SparsioQ: End-Semester Project Report · 24MAT204 – Mathematics for Intelligent Systems 3</w:t>
+      <w:t>SparsioQ: End-Semester Project Report  |  24MAT204 - Mathematics for Intelligent Systems 3</w:t>
     </w:r>
   </w:p>
 </w:hdr>

</xml_diff>

<commit_message>
Update official degree title to Bachelor of Technology in Artificial Intelligence and Data Science (Medical Engineering)
</commit_message>
<xml_diff>
--- a/SparsioQ_End_Semester_Project_Report.docx
+++ b/SparsioQ_End_Semester_Project_Report.docx
@@ -285,7 +285,7 @@
         <w:br/>
         <w:t>IN</w:t>
         <w:br/>
-        <w:t>ARTIFICIAL INTELLIGENCE AND DATA SCIENCE</w:t>
+        <w:t>ARTIFICIAL INTELLIGENCE AND DATA SCIENCE (MEDICAL ENGINEERING)</w:t>
       </w:r>
     </w:p>
     <w:p>
@@ -464,7 +464,7 @@
           <w:i w:val="0"/>
           <w:sz w:val="22"/>
         </w:rPr>
-        <w:t>This is to certify that the project report entitled "SPARSIOQ: AN END-TO-END SPARSE CONVEX OPTIMIZATION, QUANTUM-ACCELERATED RISK ESTIMATION, AND REGIME-SWITCHING SYSTEM FOR QUANTITATIVE WEALTH MANAGEMENT" submitted by MHALSA PADMAKUMAR (CB.AI.U4AIM25052), SHIZA CKV (CB.AI.U4AIM25037), ANWAIKA SANVI (CB.AI.U4AIM25044), and JOSHIKA (CB.AI.U4AIM25014) in partial fulfillment of the requirements for the award of the Degree of Bachelor of Technology in Artificial Intelligence and Data Science for the course 24MAT204 / 23MAT204 - Mathematics for Intelligent Systems 3 is a bonafide record of the work carried out under my guidance and supervision at the Department of Artificial Intelligence, School of Artificial Intelligence, Amrita Vishwa Vidyapeetham, Amritanagar, Coimbatore - 641112.</w:t>
+        <w:t>This is to certify that the project report entitled "SPARSIOQ: AN END-TO-END SPARSE CONVEX OPTIMIZATION, QUANTUM-ACCELERATED RISK ESTIMATION, AND REGIME-SWITCHING SYSTEM FOR QUANTITATIVE WEALTH MANAGEMENT" submitted by MHALSA PADMAKUMAR (CB.AI.U4AIM25052), SHIZA CKV (CB.AI.U4AIM25037), ANWAIKA SANVI (CB.AI.U4AIM25044), and JOSHIKA (CB.AI.U4AIM25014) in partial fulfillment of the requirements for the award of the Degree of Bachelor of Technology in Artificial Intelligence and Data Science (Medical Engineering) for the course 24MAT204 / 23MAT204 - Mathematics for Intelligent Systems 3 is a bonafide record of the work carried out under my guidance and supervision at the Department of Artificial Intelligence, School of Artificial Intelligence, Amrita Vishwa Vidyapeetham, Amritanagar, Coimbatore - 641112.</w:t>
       </w:r>
     </w:p>
     <w:tbl>
@@ -639,7 +639,7 @@
           <w:i w:val="0"/>
           <w:sz w:val="22"/>
         </w:rPr>
-        <w:t>We hereby declare that this project report entitled "SPARSIOQ: AN END-TO-END SPARSE CONVEX OPTIMIZATION, QUANTUM-ACCELERATED RISK ESTIMATION, AND REGIME-SWITCHING SYSTEM FOR QUANTITATIVE WEALTH MANAGEMENT" is a bonafide record of original engineering research and software platform implementation undertaken by us under the supervision and guidance of Dr. Divya C, Assistant Professor, Department of Artificial Intelligence, School of Artificial Intelligence, Amrita Vishwa Vidyapeetham, Coimbatore, in partial fulfillment of the requirements for the award of the Degree of Bachelor of Technology in Artificial Intelligence and Data Science for the course 24MAT204 / 23MAT204 - Mathematics for Intelligent Systems 3.</w:t>
+        <w:t>We hereby declare that this project report entitled "SPARSIOQ: AN END-TO-END SPARSE CONVEX OPTIMIZATION, QUANTUM-ACCELERATED RISK ESTIMATION, AND REGIME-SWITCHING SYSTEM FOR QUANTITATIVE WEALTH MANAGEMENT" is a bonafide record of original engineering research and software platform implementation undertaken by us under the supervision and guidance of Dr. Divya C, Assistant Professor, Department of Artificial Intelligence, School of Artificial Intelligence, Amrita Vishwa Vidyapeetham, Coimbatore, in partial fulfillment of the requirements for the award of the Degree of Bachelor of Technology in Artificial Intelligence and Data Science (Medical Engineering) for the course 24MAT204 / 23MAT204 - Mathematics for Intelligent Systems 3.</w:t>
         <w:br/>
         <w:br/>
         <w:t>We further confirm that this work has not formed the basis for the award of any degree, diploma, associateship, fellowship, or other similar title at this or any other university or higher education institution.</w:t>

</xml_diff>